<commit_message>
feat: repaso técnico módulo 2 y ajustes en configuración de Elastic Beanstalk
</commit_message>
<xml_diff>
--- a/beanstalk.docx
+++ b/beanstalk.docx
@@ -711,84 +711,6 @@
         </w:drawing>
       </w:r>
     </w:p>
-    <w:p>
-      <w:r>
-        <w:drawing>
-          <wp:inline distT="0" distB="0" distL="0" distR="0" wp14:anchorId="1429306D" wp14:editId="2C4B34FE">
-            <wp:extent cx="5612130" cy="3068955"/>
-            <wp:effectExtent l="0" t="0" r="7620" b="0"/>
-            <wp:docPr id="19" name="Picture 19"/>
-            <wp:cNvGraphicFramePr>
-              <a:graphicFrameLocks xmlns:a="http://schemas.openxmlformats.org/drawingml/2006/main" noChangeAspect="1"/>
-            </wp:cNvGraphicFramePr>
-            <a:graphic xmlns:a="http://schemas.openxmlformats.org/drawingml/2006/main">
-              <a:graphicData uri="http://schemas.openxmlformats.org/drawingml/2006/picture">
-                <pic:pic xmlns:pic="http://schemas.openxmlformats.org/drawingml/2006/picture">
-                  <pic:nvPicPr>
-                    <pic:cNvPr id="1" name=""/>
-                    <pic:cNvPicPr/>
-                  </pic:nvPicPr>
-                  <pic:blipFill>
-                    <a:blip r:embed="rId22"/>
-                    <a:stretch>
-                      <a:fillRect/>
-                    </a:stretch>
-                  </pic:blipFill>
-                  <pic:spPr>
-                    <a:xfrm>
-                      <a:off x="0" y="0"/>
-                      <a:ext cx="5612130" cy="3068955"/>
-                    </a:xfrm>
-                    <a:prstGeom prst="rect">
-                      <a:avLst/>
-                    </a:prstGeom>
-                  </pic:spPr>
-                </pic:pic>
-              </a:graphicData>
-            </a:graphic>
-          </wp:inline>
-        </w:drawing>
-      </w:r>
-    </w:p>
-    <w:p>
-      <w:r>
-        <w:drawing>
-          <wp:inline distT="0" distB="0" distL="0" distR="0" wp14:anchorId="69EB9CF3" wp14:editId="48D64DA0">
-            <wp:extent cx="5612130" cy="2442210"/>
-            <wp:effectExtent l="0" t="0" r="7620" b="0"/>
-            <wp:docPr id="20" name="Picture 20"/>
-            <wp:cNvGraphicFramePr>
-              <a:graphicFrameLocks xmlns:a="http://schemas.openxmlformats.org/drawingml/2006/main" noChangeAspect="1"/>
-            </wp:cNvGraphicFramePr>
-            <a:graphic xmlns:a="http://schemas.openxmlformats.org/drawingml/2006/main">
-              <a:graphicData uri="http://schemas.openxmlformats.org/drawingml/2006/picture">
-                <pic:pic xmlns:pic="http://schemas.openxmlformats.org/drawingml/2006/picture">
-                  <pic:nvPicPr>
-                    <pic:cNvPr id="1" name=""/>
-                    <pic:cNvPicPr/>
-                  </pic:nvPicPr>
-                  <pic:blipFill>
-                    <a:blip r:embed="rId23"/>
-                    <a:stretch>
-                      <a:fillRect/>
-                    </a:stretch>
-                  </pic:blipFill>
-                  <pic:spPr>
-                    <a:xfrm>
-                      <a:off x="0" y="0"/>
-                      <a:ext cx="5612130" cy="2442210"/>
-                    </a:xfrm>
-                    <a:prstGeom prst="rect">
-                      <a:avLst/>
-                    </a:prstGeom>
-                  </pic:spPr>
-                </pic:pic>
-              </a:graphicData>
-            </a:graphic>
-          </wp:inline>
-        </w:drawing>
-      </w:r>
-    </w:p>
     <w:sectPr>
       <w:pgSz w:w="12240" w:h="15840"/>
       <w:pgMar w:top="1417" w:right="1701" w:bottom="1417" w:left="1701" w:header="708" w:footer="708" w:gutter="0"/>

</xml_diff>